<commit_message>
feat(master-data): CRUD for areas, branches and issue categories
- Backend: getMasterData ('*') + add/update/deleteMasterItem (Admin);
  table/column names come from a server-side whitelist, duplicates are
  rejected, delete is refused while tickets/users/branches still refer
  to the row (usage returned per referencing table)
- Admin: new "ข้อมูลหลัก" view (sidebar + mobile tab) with tabs for
  พื้นที่ / สาขา / หมวดหมู่ and an add/edit modal
- Staff form: dropdowns now load from DB (cached, HTML list kept as
  fallback); PDF office names built from area + branch, unchanged output
- Docs: ACL table in CLAUDE.md, Master Data section in CRUD docx

Co-Authored-By: Claude Opus 5 <noreply@anthropic.com>
</commit_message>
<xml_diff>
--- a/FAST_TICKET_CRUD_Modules.docx
+++ b/FAST_TICKET_CRUD_Modules.docx
@@ -93,7 +93,7 @@
           <w:sz w:val="28"/>
           <w:szCs w:val="28"/>
         </w:rPr>
-        <w:t xml:space="preserve">16 กันยายน 2569</w:t>
+        <w:t xml:space="preserve">22 กันยายน 2569</w:t>
       </w:r>
     </w:p>
     <w:p xmlns:w="http://schemas.openxmlformats.org/wordprocessingml/2006/main"/>
@@ -107,7 +107,7 @@
     </w:p>
     <w:p xmlns:w="http://schemas.openxmlformats.org/wordprocessingml/2006/main">
       <w:r>
-        <w:t xml:space="preserve">ระบบ FAST TICKET เป็นระบบแจ้งซ่อมไอทีผ่าน LINE LIFF Application ประกอบด้วย Frontend (HTML/JS) และ Backend (Google Apps Script + Supabase PostgreSQL) โดยมีโมดูล CRUD ทั้งหมด 5 โมดูล รวม 14 Backend Actions</w:t>
+        <w:t xml:space="preserve">ระบบ FAST TICKET เป็นระบบแจ้งซ่อมไอทีผ่าน LINE LIFF Application ประกอบด้วย Frontend (HTML/JS) และ Backend (Google Apps Script + Supabase PostgreSQL) โดยมีโมดูลทั้งหมด 6 โมดูล รวม 18 Backend Actions</w:t>
       </w:r>
     </w:p>
     <w:p xmlns:w="http://schemas.openxmlformats.org/wordprocessingml/2006/main"/>
@@ -194,7 +194,7 @@
                 <w:sz w:val="28"/>
                 <w:szCs w:val="28"/>
               </w:rPr>
-              <w:t xml:space="preserve">5</w:t>
+              <w:t xml:space="preserve">6</w:t>
             </w:r>
           </w:p>
         </w:tc>
@@ -230,7 +230,7 @@
                 <w:sz w:val="28"/>
                 <w:szCs w:val="28"/>
               </w:rPr>
-              <w:t xml:space="preserve">14</w:t>
+              <w:t xml:space="preserve">18</w:t>
             </w:r>
           </w:p>
         </w:tc>
@@ -266,7 +266,7 @@
                 <w:sz w:val="28"/>
                 <w:szCs w:val="28"/>
               </w:rPr>
-              <w:t xml:space="preserve">14</w:t>
+              <w:t xml:space="preserve">17</w:t>
             </w:r>
           </w:p>
         </w:tc>
@@ -302,7 +302,7 @@
                 <w:sz w:val="28"/>
                 <w:szCs w:val="28"/>
               </w:rPr>
-              <w:t xml:space="preserve">1 (Knowledge Base)</w:t>
+              <w:t xml:space="preserve">2 (Knowledge Base, Master Data)</w:t>
             </w:r>
           </w:p>
         </w:tc>
@@ -2629,7 +2629,438 @@
         <w:pStyle w:val="Heading2"/>
       </w:pPr>
       <w:r>
-        <w:t xml:space="preserve">3.5 Module: Admin Views (หน้าจอ Admin Panel)</w:t>
+        <w:t xml:space="preserve">3.5 Module: Master Data (ข้อมูลหลัก)</w:t>
+      </w:r>
+    </w:p>
+    <w:p xmlns:w="http://schemas.openxmlformats.org/wordprocessingml/2006/main">
+      <w:r>
+        <w:t xml:space="preserve">ตาราง: BRANCH (พื้นที่), DEPARTMENT (สาขา), ISSUE_CATEGORY (หมวดหมู่ปัญหา)</w:t>
+      </w:r>
+    </w:p>
+    <w:p xmlns:w="http://schemas.openxmlformats.org/wordprocessingml/2006/main"/>
+    <w:tbl xmlns:w="http://schemas.openxmlformats.org/wordprocessingml/2006/main">
+      <w:tblPr>
+        <w:tblStyle w:val="TableGrid"/>
+        <w:tblW w:w="5000" w:type="pct"/>
+        <w:tblLook w:val="04A0"/>
+      </w:tblPr>
+      <w:tblGrid>
+        <w:gridCol w:w="2500"/>
+        <w:gridCol w:w="1200"/>
+        <w:gridCol w:w="2000"/>
+        <w:gridCol w:w="4000"/>
+      </w:tblGrid>
+      <w:tr>
+        <w:tc>
+          <w:tcPr>
+            <w:shd w:val="clear" w:color="auto" w:fill="1E40AF"/>
+          </w:tcPr>
+          <w:p>
+            <w:pPr>
+              <w:jc w:val="center"/>
+            </w:pPr>
+            <w:r>
+              <w:rPr>
+                <w:b/>
+                <w:bCs/>
+                <w:color w:val="FFFFFF"/>
+                <w:sz w:val="28"/>
+                <w:szCs w:val="28"/>
+              </w:rPr>
+              <w:t>Action</w:t>
+            </w:r>
+          </w:p>
+        </w:tc>
+        <w:tc>
+          <w:tcPr>
+            <w:shd w:val="clear" w:color="auto" w:fill="1E40AF"/>
+          </w:tcPr>
+          <w:p>
+            <w:pPr>
+              <w:jc w:val="center"/>
+            </w:pPr>
+            <w:r>
+              <w:rPr>
+                <w:b/>
+                <w:bCs/>
+                <w:color w:val="FFFFFF"/>
+                <w:sz w:val="28"/>
+                <w:szCs w:val="28"/>
+              </w:rPr>
+              <w:t>CRUD</w:t>
+            </w:r>
+          </w:p>
+        </w:tc>
+        <w:tc>
+          <w:tcPr>
+            <w:shd w:val="clear" w:color="auto" w:fill="1E40AF"/>
+          </w:tcPr>
+          <w:p>
+            <w:pPr>
+              <w:jc w:val="center"/>
+            </w:pPr>
+            <w:r>
+              <w:rPr>
+                <w:b/>
+                <w:bCs/>
+                <w:color w:val="FFFFFF"/>
+                <w:sz w:val="28"/>
+                <w:szCs w:val="28"/>
+              </w:rPr>
+              <w:t>สิทธิ์ (ACL)</w:t>
+            </w:r>
+          </w:p>
+        </w:tc>
+        <w:tc>
+          <w:tcPr>
+            <w:shd w:val="clear" w:color="auto" w:fill="1E40AF"/>
+          </w:tcPr>
+          <w:p>
+            <w:pPr>
+              <w:jc w:val="center"/>
+            </w:pPr>
+            <w:r>
+              <w:rPr>
+                <w:b/>
+                <w:bCs/>
+                <w:color w:val="FFFFFF"/>
+                <w:sz w:val="28"/>
+                <w:szCs w:val="28"/>
+              </w:rPr>
+              <w:t>คำอธิบาย</w:t>
+            </w:r>
+          </w:p>
+        </w:tc>
+      </w:tr>
+      <w:tr>
+        <w:tc>
+          <w:tcPr>
+            <w:shd w:val="clear" w:color="auto" w:fill="F1F5F9"/>
+          </w:tcPr>
+          <w:p>
+            <w:pPr>
+              <w:jc w:val="left"/>
+            </w:pPr>
+            <w:r>
+              <w:rPr>
+                <w:sz w:val="28"/>
+                <w:szCs w:val="28"/>
+              </w:rPr>
+              <w:t xml:space="preserve">addMasterItem</w:t>
+            </w:r>
+          </w:p>
+        </w:tc>
+        <w:tc>
+          <w:tcPr>
+            <w:shd w:val="clear" w:color="auto" w:fill="F1F5F9"/>
+          </w:tcPr>
+          <w:p>
+            <w:pPr>
+              <w:jc w:val="center"/>
+            </w:pPr>
+            <w:r>
+              <w:rPr>
+                <w:sz w:val="28"/>
+                <w:szCs w:val="28"/>
+              </w:rPr>
+              <w:t xml:space="preserve">Create</w:t>
+            </w:r>
+          </w:p>
+        </w:tc>
+        <w:tc>
+          <w:tcPr>
+            <w:shd w:val="clear" w:color="auto" w:fill="F1F5F9"/>
+          </w:tcPr>
+          <w:p>
+            <w:pPr>
+              <w:jc w:val="center"/>
+            </w:pPr>
+            <w:r>
+              <w:rPr>
+                <w:sz w:val="28"/>
+                <w:szCs w:val="28"/>
+              </w:rPr>
+              <w:t xml:space="preserve">Admin</w:t>
+            </w:r>
+          </w:p>
+        </w:tc>
+        <w:tc>
+          <w:tcPr>
+            <w:shd w:val="clear" w:color="auto" w:fill="F1F5F9"/>
+          </w:tcPr>
+          <w:p>
+            <w:pPr>
+              <w:jc w:val="center"/>
+            </w:pPr>
+            <w:r>
+              <w:rPr>
+                <w:sz w:val="28"/>
+                <w:szCs w:val="28"/>
+              </w:rPr>
+              <w:t xml:space="preserve">เพิ่มพื้นที่ / สาขา / หมวดหมู่ (กันชื่อซ้ำ)</w:t>
+            </w:r>
+          </w:p>
+        </w:tc>
+      </w:tr>
+      <w:tr>
+        <w:tc>
+          <w:tcPr>
+            <w:shd w:val="clear" w:color="auto" w:fill="FFFFFF"/>
+          </w:tcPr>
+          <w:p>
+            <w:pPr>
+              <w:jc w:val="left"/>
+            </w:pPr>
+            <w:r>
+              <w:rPr>
+                <w:sz w:val="28"/>
+                <w:szCs w:val="28"/>
+              </w:rPr>
+              <w:t xml:space="preserve">getMasterData</w:t>
+            </w:r>
+          </w:p>
+        </w:tc>
+        <w:tc>
+          <w:tcPr>
+            <w:shd w:val="clear" w:color="auto" w:fill="FFFFFF"/>
+          </w:tcPr>
+          <w:p>
+            <w:pPr>
+              <w:jc w:val="center"/>
+            </w:pPr>
+            <w:r>
+              <w:rPr>
+                <w:sz w:val="28"/>
+                <w:szCs w:val="28"/>
+              </w:rPr>
+              <w:t xml:space="preserve">Read</w:t>
+            </w:r>
+          </w:p>
+        </w:tc>
+        <w:tc>
+          <w:tcPr>
+            <w:shd w:val="clear" w:color="auto" w:fill="FFFFFF"/>
+          </w:tcPr>
+          <w:p>
+            <w:pPr>
+              <w:jc w:val="center"/>
+            </w:pPr>
+            <w:r>
+              <w:rPr>
+                <w:sz w:val="28"/>
+                <w:szCs w:val="28"/>
+              </w:rPr>
+              <w:t xml:space="preserve">* (ทุกคน)</w:t>
+            </w:r>
+          </w:p>
+        </w:tc>
+        <w:tc>
+          <w:tcPr>
+            <w:shd w:val="clear" w:color="auto" w:fill="FFFFFF"/>
+          </w:tcPr>
+          <w:p>
+            <w:pPr>
+              <w:jc w:val="center"/>
+            </w:pPr>
+            <w:r>
+              <w:rPr>
+                <w:sz w:val="28"/>
+                <w:szCs w:val="28"/>
+              </w:rPr>
+              <w:t xml:space="preserve">ดึงข้อมูลหลักทั้ง 3 ตาราง พร้อมจำนวนที่ถูกใช้ ใช้เติม dropdown ในฟอร์มแจ้งซ่อม</w:t>
+            </w:r>
+          </w:p>
+        </w:tc>
+      </w:tr>
+      <w:tr>
+        <w:tc>
+          <w:tcPr>
+            <w:shd w:val="clear" w:color="auto" w:fill="F1F5F9"/>
+          </w:tcPr>
+          <w:p>
+            <w:pPr>
+              <w:jc w:val="left"/>
+            </w:pPr>
+            <w:r>
+              <w:rPr>
+                <w:sz w:val="28"/>
+                <w:szCs w:val="28"/>
+              </w:rPr>
+              <w:t xml:space="preserve">updateMasterItem</w:t>
+            </w:r>
+          </w:p>
+        </w:tc>
+        <w:tc>
+          <w:tcPr>
+            <w:shd w:val="clear" w:color="auto" w:fill="F1F5F9"/>
+          </w:tcPr>
+          <w:p>
+            <w:pPr>
+              <w:jc w:val="center"/>
+            </w:pPr>
+            <w:r>
+              <w:rPr>
+                <w:sz w:val="28"/>
+                <w:szCs w:val="28"/>
+              </w:rPr>
+              <w:t xml:space="preserve">Update</w:t>
+            </w:r>
+          </w:p>
+        </w:tc>
+        <w:tc>
+          <w:tcPr>
+            <w:shd w:val="clear" w:color="auto" w:fill="F1F5F9"/>
+          </w:tcPr>
+          <w:p>
+            <w:pPr>
+              <w:jc w:val="center"/>
+            </w:pPr>
+            <w:r>
+              <w:rPr>
+                <w:sz w:val="28"/>
+                <w:szCs w:val="28"/>
+              </w:rPr>
+              <w:t xml:space="preserve">Admin</w:t>
+            </w:r>
+          </w:p>
+        </w:tc>
+        <w:tc>
+          <w:tcPr>
+            <w:shd w:val="clear" w:color="auto" w:fill="F1F5F9"/>
+          </w:tcPr>
+          <w:p>
+            <w:pPr>
+              <w:jc w:val="center"/>
+            </w:pPr>
+            <w:r>
+              <w:rPr>
+                <w:sz w:val="28"/>
+                <w:szCs w:val="28"/>
+              </w:rPr>
+              <w:t xml:space="preserve">แก้ไขชื่อ / จังหวัด / พื้นที่ที่สาขาสังกัด</w:t>
+            </w:r>
+          </w:p>
+        </w:tc>
+      </w:tr>
+      <w:tr>
+        <w:tc>
+          <w:tcPr>
+            <w:shd w:val="clear" w:color="auto" w:fill="FFFFFF"/>
+          </w:tcPr>
+          <w:p>
+            <w:pPr>
+              <w:jc w:val="left"/>
+            </w:pPr>
+            <w:r>
+              <w:rPr>
+                <w:sz w:val="28"/>
+                <w:szCs w:val="28"/>
+              </w:rPr>
+              <w:t xml:space="preserve">deleteMasterItem</w:t>
+            </w:r>
+          </w:p>
+        </w:tc>
+        <w:tc>
+          <w:tcPr>
+            <w:shd w:val="clear" w:color="auto" w:fill="FFFFFF"/>
+          </w:tcPr>
+          <w:p>
+            <w:pPr>
+              <w:jc w:val="center"/>
+            </w:pPr>
+            <w:r>
+              <w:rPr>
+                <w:sz w:val="28"/>
+                <w:szCs w:val="28"/>
+              </w:rPr>
+              <w:t xml:space="preserve">Delete</w:t>
+            </w:r>
+          </w:p>
+        </w:tc>
+        <w:tc>
+          <w:tcPr>
+            <w:shd w:val="clear" w:color="auto" w:fill="FFFFFF"/>
+          </w:tcPr>
+          <w:p>
+            <w:pPr>
+              <w:jc w:val="center"/>
+            </w:pPr>
+            <w:r>
+              <w:rPr>
+                <w:sz w:val="28"/>
+                <w:szCs w:val="28"/>
+              </w:rPr>
+              <w:t xml:space="preserve">Admin</w:t>
+            </w:r>
+          </w:p>
+        </w:tc>
+        <w:tc>
+          <w:tcPr>
+            <w:shd w:val="clear" w:color="auto" w:fill="FFFFFF"/>
+          </w:tcPr>
+          <w:p>
+            <w:pPr>
+              <w:jc w:val="center"/>
+            </w:pPr>
+            <w:r>
+              <w:rPr>
+                <w:sz w:val="28"/>
+                <w:szCs w:val="28"/>
+              </w:rPr>
+              <w:t xml:space="preserve">ลบได้เฉพาะรายการที่ไม่มีตั๋ว ผู้ใช้ หรือสาขาอ้างถึง</w:t>
+            </w:r>
+          </w:p>
+        </w:tc>
+      </w:tr>
+    </w:tbl>
+    <w:p xmlns:w="http://schemas.openxmlformats.org/wordprocessingml/2006/main"/>
+    <w:p xmlns:w="http://schemas.openxmlformats.org/wordprocessingml/2006/main">
+      <w:r>
+        <w:rPr>
+          <w:b/>
+          <w:bCs/>
+          <w:color w:val="374151"/>
+          <w:sz w:val="28"/>
+          <w:szCs w:val="28"/>
+        </w:rPr>
+        <w:t xml:space="preserve">สถานะ CRUD: </w:t>
+      </w:r>
+      <w:r>
+        <w:rPr>
+          <w:color w:val="059669"/>
+          <w:sz w:val="28"/>
+          <w:szCs w:val="28"/>
+        </w:rPr>
+        <w:t xml:space="preserve">C R U D ครบทั้ง 4 Operations ครอบคลุม 3 ตาราง</w:t>
+      </w:r>
+    </w:p>
+    <w:p xmlns:w="http://schemas.openxmlformats.org/wordprocessingml/2006/main">
+      <w:r>
+        <w:rPr>
+          <w:b/>
+          <w:bCs/>
+          <w:color w:val="374151"/>
+          <w:sz w:val="28"/>
+          <w:szCs w:val="28"/>
+        </w:rPr>
+        <w:t xml:space="preserve">ความปลอดภัย: </w:t>
+      </w:r>
+      <w:r>
+        <w:rPr>
+          <w:color w:val="6B7280"/>
+          <w:sz w:val="28"/>
+          <w:szCs w:val="28"/>
+        </w:rPr>
+        <w:t xml:space="preserve">client ส่งมาเพียงประเภท (branch / dept / category) ชื่อตารางและคอลัมน์กำหนดฝั่ง server เท่านั้น ป้องกัน SQL Injection</w:t>
+      </w:r>
+    </w:p>
+    <w:p xmlns:w="http://schemas.openxmlformats.org/wordprocessingml/2006/main"/>
+    <w:p xmlns:w="http://schemas.openxmlformats.org/wordprocessingml/2006/main">
+      <w:pPr>
+        <w:pStyle w:val="Heading2"/>
+      </w:pPr>
+      <w:r>
+        <w:t xml:space="preserve">3.6 Module: Admin Views (หน้าจอ Admin Panel)</w:t>
       </w:r>
     </w:p>
     <w:p xmlns:w="http://schemas.openxmlformats.org/wordprocessingml/2006/main">
@@ -3026,13 +3457,83 @@
                 <w:sz w:val="28"/>
                 <w:szCs w:val="28"/>
               </w:rPr>
+              <w:t xml:space="preserve">Master Data (ข้อมูลหลัก)</w:t>
+            </w:r>
+          </w:p>
+        </w:tc>
+        <w:tc>
+          <w:tcPr>
+            <w:shd w:val="clear" w:color="auto" w:fill="F1F5F9"/>
+          </w:tcPr>
+          <w:p>
+            <w:pPr>
+              <w:jc w:val="center"/>
+            </w:pPr>
+            <w:r>
+              <w:rPr>
+                <w:sz w:val="28"/>
+                <w:szCs w:val="28"/>
+              </w:rPr>
+              <w:t xml:space="preserve">CRUD</w:t>
+            </w:r>
+          </w:p>
+        </w:tc>
+        <w:tc>
+          <w:tcPr>
+            <w:shd w:val="clear" w:color="auto" w:fill="F1F5F9"/>
+          </w:tcPr>
+          <w:p>
+            <w:pPr>
+              <w:jc w:val="center"/>
+            </w:pPr>
+            <w:r>
+              <w:rPr>
+                <w:sz w:val="28"/>
+                <w:szCs w:val="28"/>
+              </w:rPr>
+              <w:t xml:space="preserve">Admin</w:t>
+            </w:r>
+          </w:p>
+        </w:tc>
+        <w:tc>
+          <w:tcPr>
+            <w:shd w:val="clear" w:color="auto" w:fill="F1F5F9"/>
+          </w:tcPr>
+          <w:p>
+            <w:pPr>
+              <w:jc w:val="center"/>
+            </w:pPr>
+            <w:r>
+              <w:rPr>
+                <w:sz w:val="28"/>
+                <w:szCs w:val="28"/>
+              </w:rPr>
+              <w:t xml:space="preserve">จัดการพื้นที่ สาขา หมวดหมู่ปัญหา</w:t>
+            </w:r>
+          </w:p>
+        </w:tc>
+      </w:tr>
+      <w:tr>
+        <w:tc>
+          <w:tcPr>
+            <w:shd w:val="clear" w:color="auto" w:fill="FFFFFF"/>
+          </w:tcPr>
+          <w:p>
+            <w:pPr>
+              <w:jc w:val="left"/>
+            </w:pPr>
+            <w:r>
+              <w:rPr>
+                <w:sz w:val="28"/>
+                <w:szCs w:val="28"/>
+              </w:rPr>
               <w:t xml:space="preserve">Settings (ตั้งค่า)</w:t>
             </w:r>
           </w:p>
         </w:tc>
         <w:tc>
           <w:tcPr>
-            <w:shd w:val="clear" w:color="auto" w:fill="F1F5F9"/>
+            <w:shd w:val="clear" w:color="auto" w:fill="FFFFFF"/>
           </w:tcPr>
           <w:p>
             <w:pPr>
@@ -3049,7 +3550,7 @@
         </w:tc>
         <w:tc>
           <w:tcPr>
-            <w:shd w:val="clear" w:color="auto" w:fill="F1F5F9"/>
+            <w:shd w:val="clear" w:color="auto" w:fill="FFFFFF"/>
           </w:tcPr>
           <w:p>
             <w:pPr>
@@ -3066,7 +3567,7 @@
         </w:tc>
         <w:tc>
           <w:tcPr>
-            <w:shd w:val="clear" w:color="auto" w:fill="F1F5F9"/>
+            <w:shd w:val="clear" w:color="auto" w:fill="FFFFFF"/>
           </w:tcPr>
           <w:p>
             <w:pPr>
@@ -3481,13 +3982,83 @@
                 <w:sz w:val="28"/>
                 <w:szCs w:val="28"/>
               </w:rPr>
+              <w:t xml:space="preserve">getMasterData</w:t>
+            </w:r>
+          </w:p>
+        </w:tc>
+        <w:tc>
+          <w:tcPr>
+            <w:shd w:val="clear" w:color="auto" w:fill="F1F5F9"/>
+          </w:tcPr>
+          <w:p>
+            <w:pPr>
+              <w:jc w:val="center"/>
+            </w:pPr>
+            <w:r>
+              <w:rPr>
+                <w:sz w:val="28"/>
+                <w:szCs w:val="28"/>
+              </w:rPr>
+              <w:t xml:space="preserve">Y</w:t>
+            </w:r>
+          </w:p>
+        </w:tc>
+        <w:tc>
+          <w:tcPr>
+            <w:shd w:val="clear" w:color="auto" w:fill="F1F5F9"/>
+          </w:tcPr>
+          <w:p>
+            <w:pPr>
+              <w:jc w:val="center"/>
+            </w:pPr>
+            <w:r>
+              <w:rPr>
+                <w:sz w:val="28"/>
+                <w:szCs w:val="28"/>
+              </w:rPr>
+              <w:t xml:space="preserve">Y</w:t>
+            </w:r>
+          </w:p>
+        </w:tc>
+        <w:tc>
+          <w:tcPr>
+            <w:shd w:val="clear" w:color="auto" w:fill="F1F5F9"/>
+          </w:tcPr>
+          <w:p>
+            <w:pPr>
+              <w:jc w:val="center"/>
+            </w:pPr>
+            <w:r>
+              <w:rPr>
+                <w:sz w:val="28"/>
+                <w:szCs w:val="28"/>
+              </w:rPr>
+              <w:t xml:space="preserve">Y</w:t>
+            </w:r>
+          </w:p>
+        </w:tc>
+      </w:tr>
+      <w:tr>
+        <w:tc>
+          <w:tcPr>
+            <w:shd w:val="clear" w:color="auto" w:fill="FFFFFF"/>
+          </w:tcPr>
+          <w:p>
+            <w:pPr>
+              <w:jc w:val="left"/>
+            </w:pPr>
+            <w:r>
+              <w:rPr>
+                <w:sz w:val="28"/>
+                <w:szCs w:val="28"/>
+              </w:rPr>
               <w:t xml:space="preserve">getTickets</w:t>
             </w:r>
           </w:p>
         </w:tc>
         <w:tc>
           <w:tcPr>
-            <w:shd w:val="clear" w:color="auto" w:fill="F1F5F9"/>
+            <w:shd w:val="clear" w:color="auto" w:fill="FFFFFF"/>
           </w:tcPr>
           <w:p>
             <w:pPr>
@@ -3504,7 +4075,7 @@
         </w:tc>
         <w:tc>
           <w:tcPr>
-            <w:shd w:val="clear" w:color="auto" w:fill="F1F5F9"/>
+            <w:shd w:val="clear" w:color="auto" w:fill="FFFFFF"/>
           </w:tcPr>
           <w:p>
             <w:pPr>
@@ -3521,7 +4092,7 @@
         </w:tc>
         <w:tc>
           <w:tcPr>
-            <w:shd w:val="clear" w:color="auto" w:fill="F1F5F9"/>
+            <w:shd w:val="clear" w:color="auto" w:fill="FFFFFF"/>
           </w:tcPr>
           <w:p>
             <w:pPr>
@@ -3540,7 +4111,7 @@
       <w:tr>
         <w:tc>
           <w:tcPr>
-            <w:shd w:val="clear" w:color="auto" w:fill="FFFFFF"/>
+            <w:shd w:val="clear" w:color="auto" w:fill="F1F5F9"/>
           </w:tcPr>
           <w:p>
             <w:pPr>
@@ -3557,7 +4128,7 @@
         </w:tc>
         <w:tc>
           <w:tcPr>
-            <w:shd w:val="clear" w:color="auto" w:fill="FFFFFF"/>
+            <w:shd w:val="clear" w:color="auto" w:fill="F1F5F9"/>
           </w:tcPr>
           <w:p>
             <w:pPr>
@@ -3574,7 +4145,7 @@
         </w:tc>
         <w:tc>
           <w:tcPr>
-            <w:shd w:val="clear" w:color="auto" w:fill="FFFFFF"/>
+            <w:shd w:val="clear" w:color="auto" w:fill="F1F5F9"/>
           </w:tcPr>
           <w:p>
             <w:pPr>
@@ -3591,7 +4162,7 @@
         </w:tc>
         <w:tc>
           <w:tcPr>
-            <w:shd w:val="clear" w:color="auto" w:fill="FFFFFF"/>
+            <w:shd w:val="clear" w:color="auto" w:fill="F1F5F9"/>
           </w:tcPr>
           <w:p>
             <w:pPr>
@@ -3610,7 +4181,7 @@
       <w:tr>
         <w:tc>
           <w:tcPr>
-            <w:shd w:val="clear" w:color="auto" w:fill="F1F5F9"/>
+            <w:shd w:val="clear" w:color="auto" w:fill="FFFFFF"/>
           </w:tcPr>
           <w:p>
             <w:pPr>
@@ -3627,7 +4198,7 @@
         </w:tc>
         <w:tc>
           <w:tcPr>
-            <w:shd w:val="clear" w:color="auto" w:fill="F1F5F9"/>
+            <w:shd w:val="clear" w:color="auto" w:fill="FFFFFF"/>
           </w:tcPr>
           <w:p>
             <w:pPr>
@@ -3644,7 +4215,7 @@
         </w:tc>
         <w:tc>
           <w:tcPr>
-            <w:shd w:val="clear" w:color="auto" w:fill="F1F5F9"/>
+            <w:shd w:val="clear" w:color="auto" w:fill="FFFFFF"/>
           </w:tcPr>
           <w:p>
             <w:pPr>
@@ -3661,7 +4232,7 @@
         </w:tc>
         <w:tc>
           <w:tcPr>
-            <w:shd w:val="clear" w:color="auto" w:fill="F1F5F9"/>
+            <w:shd w:val="clear" w:color="auto" w:fill="FFFFFF"/>
           </w:tcPr>
           <w:p>
             <w:pPr>
@@ -3680,7 +4251,7 @@
       <w:tr>
         <w:tc>
           <w:tcPr>
-            <w:shd w:val="clear" w:color="auto" w:fill="FFFFFF"/>
+            <w:shd w:val="clear" w:color="auto" w:fill="F1F5F9"/>
           </w:tcPr>
           <w:p>
             <w:pPr>
@@ -3697,7 +4268,7 @@
         </w:tc>
         <w:tc>
           <w:tcPr>
-            <w:shd w:val="clear" w:color="auto" w:fill="FFFFFF"/>
+            <w:shd w:val="clear" w:color="auto" w:fill="F1F5F9"/>
           </w:tcPr>
           <w:p>
             <w:pPr>
@@ -3714,7 +4285,7 @@
         </w:tc>
         <w:tc>
           <w:tcPr>
-            <w:shd w:val="clear" w:color="auto" w:fill="FFFFFF"/>
+            <w:shd w:val="clear" w:color="auto" w:fill="F1F5F9"/>
           </w:tcPr>
           <w:p>
             <w:pPr>
@@ -3731,7 +4302,7 @@
         </w:tc>
         <w:tc>
           <w:tcPr>
-            <w:shd w:val="clear" w:color="auto" w:fill="FFFFFF"/>
+            <w:shd w:val="clear" w:color="auto" w:fill="F1F5F9"/>
           </w:tcPr>
           <w:p>
             <w:pPr>
@@ -3750,7 +4321,7 @@
       <w:tr>
         <w:tc>
           <w:tcPr>
-            <w:shd w:val="clear" w:color="auto" w:fill="F1F5F9"/>
+            <w:shd w:val="clear" w:color="auto" w:fill="FFFFFF"/>
           </w:tcPr>
           <w:p>
             <w:pPr>
@@ -3767,7 +4338,7 @@
         </w:tc>
         <w:tc>
           <w:tcPr>
-            <w:shd w:val="clear" w:color="auto" w:fill="F1F5F9"/>
+            <w:shd w:val="clear" w:color="auto" w:fill="FFFFFF"/>
           </w:tcPr>
           <w:p>
             <w:pPr>
@@ -3784,7 +4355,7 @@
         </w:tc>
         <w:tc>
           <w:tcPr>
-            <w:shd w:val="clear" w:color="auto" w:fill="F1F5F9"/>
+            <w:shd w:val="clear" w:color="auto" w:fill="FFFFFF"/>
           </w:tcPr>
           <w:p>
             <w:pPr>
@@ -3801,7 +4372,7 @@
         </w:tc>
         <w:tc>
           <w:tcPr>
-            <w:shd w:val="clear" w:color="auto" w:fill="F1F5F9"/>
+            <w:shd w:val="clear" w:color="auto" w:fill="FFFFFF"/>
           </w:tcPr>
           <w:p>
             <w:pPr>
@@ -3820,7 +4391,7 @@
       <w:tr>
         <w:tc>
           <w:tcPr>
-            <w:shd w:val="clear" w:color="auto" w:fill="FFFFFF"/>
+            <w:shd w:val="clear" w:color="auto" w:fill="F1F5F9"/>
           </w:tcPr>
           <w:p>
             <w:pPr>
@@ -3837,7 +4408,7 @@
         </w:tc>
         <w:tc>
           <w:tcPr>
-            <w:shd w:val="clear" w:color="auto" w:fill="FFFFFF"/>
+            <w:shd w:val="clear" w:color="auto" w:fill="F1F5F9"/>
           </w:tcPr>
           <w:p>
             <w:pPr>
@@ -3854,7 +4425,7 @@
         </w:tc>
         <w:tc>
           <w:tcPr>
-            <w:shd w:val="clear" w:color="auto" w:fill="FFFFFF"/>
+            <w:shd w:val="clear" w:color="auto" w:fill="F1F5F9"/>
           </w:tcPr>
           <w:p>
             <w:pPr>
@@ -3871,7 +4442,7 @@
         </w:tc>
         <w:tc>
           <w:tcPr>
-            <w:shd w:val="clear" w:color="auto" w:fill="FFFFFF"/>
+            <w:shd w:val="clear" w:color="auto" w:fill="F1F5F9"/>
           </w:tcPr>
           <w:p>
             <w:pPr>
@@ -3890,7 +4461,7 @@
       <w:tr>
         <w:tc>
           <w:tcPr>
-            <w:shd w:val="clear" w:color="auto" w:fill="F1F5F9"/>
+            <w:shd w:val="clear" w:color="auto" w:fill="FFFFFF"/>
           </w:tcPr>
           <w:p>
             <w:pPr>
@@ -3907,7 +4478,7 @@
         </w:tc>
         <w:tc>
           <w:tcPr>
-            <w:shd w:val="clear" w:color="auto" w:fill="F1F5F9"/>
+            <w:shd w:val="clear" w:color="auto" w:fill="FFFFFF"/>
           </w:tcPr>
           <w:p>
             <w:pPr>
@@ -3924,7 +4495,7 @@
         </w:tc>
         <w:tc>
           <w:tcPr>
-            <w:shd w:val="clear" w:color="auto" w:fill="F1F5F9"/>
+            <w:shd w:val="clear" w:color="auto" w:fill="FFFFFF"/>
           </w:tcPr>
           <w:p>
             <w:pPr>
@@ -3941,7 +4512,7 @@
         </w:tc>
         <w:tc>
           <w:tcPr>
-            <w:shd w:val="clear" w:color="auto" w:fill="F1F5F9"/>
+            <w:shd w:val="clear" w:color="auto" w:fill="FFFFFF"/>
           </w:tcPr>
           <w:p>
             <w:pPr>
@@ -3960,7 +4531,7 @@
       <w:tr>
         <w:tc>
           <w:tcPr>
-            <w:shd w:val="clear" w:color="auto" w:fill="FFFFFF"/>
+            <w:shd w:val="clear" w:color="auto" w:fill="F1F5F9"/>
           </w:tcPr>
           <w:p>
             <w:pPr>
@@ -3977,7 +4548,7 @@
         </w:tc>
         <w:tc>
           <w:tcPr>
-            <w:shd w:val="clear" w:color="auto" w:fill="FFFFFF"/>
+            <w:shd w:val="clear" w:color="auto" w:fill="F1F5F9"/>
           </w:tcPr>
           <w:p>
             <w:pPr>
@@ -3994,7 +4565,7 @@
         </w:tc>
         <w:tc>
           <w:tcPr>
-            <w:shd w:val="clear" w:color="auto" w:fill="FFFFFF"/>
+            <w:shd w:val="clear" w:color="auto" w:fill="F1F5F9"/>
           </w:tcPr>
           <w:p>
             <w:pPr>
@@ -4011,7 +4582,7 @@
         </w:tc>
         <w:tc>
           <w:tcPr>
-            <w:shd w:val="clear" w:color="auto" w:fill="FFFFFF"/>
+            <w:shd w:val="clear" w:color="auto" w:fill="F1F5F9"/>
           </w:tcPr>
           <w:p>
             <w:pPr>
@@ -4030,7 +4601,7 @@
       <w:tr>
         <w:tc>
           <w:tcPr>
-            <w:shd w:val="clear" w:color="auto" w:fill="F1F5F9"/>
+            <w:shd w:val="clear" w:color="auto" w:fill="FFFFFF"/>
           </w:tcPr>
           <w:p>
             <w:pPr>
@@ -4047,7 +4618,7 @@
         </w:tc>
         <w:tc>
           <w:tcPr>
-            <w:shd w:val="clear" w:color="auto" w:fill="F1F5F9"/>
+            <w:shd w:val="clear" w:color="auto" w:fill="FFFFFF"/>
           </w:tcPr>
           <w:p>
             <w:pPr>
@@ -4064,7 +4635,7 @@
         </w:tc>
         <w:tc>
           <w:tcPr>
-            <w:shd w:val="clear" w:color="auto" w:fill="F1F5F9"/>
+            <w:shd w:val="clear" w:color="auto" w:fill="FFFFFF"/>
           </w:tcPr>
           <w:p>
             <w:pPr>
@@ -4081,7 +4652,7 @@
         </w:tc>
         <w:tc>
           <w:tcPr>
-            <w:shd w:val="clear" w:color="auto" w:fill="F1F5F9"/>
+            <w:shd w:val="clear" w:color="auto" w:fill="FFFFFF"/>
           </w:tcPr>
           <w:p>
             <w:pPr>
@@ -4100,7 +4671,7 @@
       <w:tr>
         <w:tc>
           <w:tcPr>
-            <w:shd w:val="clear" w:color="auto" w:fill="FFFFFF"/>
+            <w:shd w:val="clear" w:color="auto" w:fill="F1F5F9"/>
           </w:tcPr>
           <w:p>
             <w:pPr>
@@ -4112,6 +4683,216 @@
                 <w:szCs w:val="28"/>
               </w:rPr>
               <w:t xml:space="preserve">updateUserRole</w:t>
+            </w:r>
+          </w:p>
+        </w:tc>
+        <w:tc>
+          <w:tcPr>
+            <w:shd w:val="clear" w:color="auto" w:fill="F1F5F9"/>
+          </w:tcPr>
+          <w:p>
+            <w:pPr>
+              <w:jc w:val="center"/>
+            </w:pPr>
+            <w:r>
+              <w:rPr>
+                <w:sz w:val="28"/>
+                <w:szCs w:val="28"/>
+              </w:rPr>
+              <w:t xml:space="preserve">-</w:t>
+            </w:r>
+          </w:p>
+        </w:tc>
+        <w:tc>
+          <w:tcPr>
+            <w:shd w:val="clear" w:color="auto" w:fill="F1F5F9"/>
+          </w:tcPr>
+          <w:p>
+            <w:pPr>
+              <w:jc w:val="center"/>
+            </w:pPr>
+            <w:r>
+              <w:rPr>
+                <w:sz w:val="28"/>
+                <w:szCs w:val="28"/>
+              </w:rPr>
+              <w:t xml:space="preserve">-</w:t>
+            </w:r>
+          </w:p>
+        </w:tc>
+        <w:tc>
+          <w:tcPr>
+            <w:shd w:val="clear" w:color="auto" w:fill="F1F5F9"/>
+          </w:tcPr>
+          <w:p>
+            <w:pPr>
+              <w:jc w:val="center"/>
+            </w:pPr>
+            <w:r>
+              <w:rPr>
+                <w:sz w:val="28"/>
+                <w:szCs w:val="28"/>
+              </w:rPr>
+              <w:t xml:space="preserve">Y</w:t>
+            </w:r>
+          </w:p>
+        </w:tc>
+      </w:tr>
+      <w:tr>
+        <w:tc>
+          <w:tcPr>
+            <w:shd w:val="clear" w:color="auto" w:fill="FFFFFF"/>
+          </w:tcPr>
+          <w:p>
+            <w:pPr>
+              <w:jc w:val="left"/>
+            </w:pPr>
+            <w:r>
+              <w:rPr>
+                <w:sz w:val="28"/>
+                <w:szCs w:val="28"/>
+              </w:rPr>
+              <w:t xml:space="preserve">addMasterItem</w:t>
+            </w:r>
+          </w:p>
+        </w:tc>
+        <w:tc>
+          <w:tcPr>
+            <w:shd w:val="clear" w:color="auto" w:fill="FFFFFF"/>
+          </w:tcPr>
+          <w:p>
+            <w:pPr>
+              <w:jc w:val="center"/>
+            </w:pPr>
+            <w:r>
+              <w:rPr>
+                <w:sz w:val="28"/>
+                <w:szCs w:val="28"/>
+              </w:rPr>
+              <w:t xml:space="preserve">-</w:t>
+            </w:r>
+          </w:p>
+        </w:tc>
+        <w:tc>
+          <w:tcPr>
+            <w:shd w:val="clear" w:color="auto" w:fill="FFFFFF"/>
+          </w:tcPr>
+          <w:p>
+            <w:pPr>
+              <w:jc w:val="center"/>
+            </w:pPr>
+            <w:r>
+              <w:rPr>
+                <w:sz w:val="28"/>
+                <w:szCs w:val="28"/>
+              </w:rPr>
+              <w:t xml:space="preserve">-</w:t>
+            </w:r>
+          </w:p>
+        </w:tc>
+        <w:tc>
+          <w:tcPr>
+            <w:shd w:val="clear" w:color="auto" w:fill="FFFFFF"/>
+          </w:tcPr>
+          <w:p>
+            <w:pPr>
+              <w:jc w:val="center"/>
+            </w:pPr>
+            <w:r>
+              <w:rPr>
+                <w:sz w:val="28"/>
+                <w:szCs w:val="28"/>
+              </w:rPr>
+              <w:t xml:space="preserve">Y</w:t>
+            </w:r>
+          </w:p>
+        </w:tc>
+      </w:tr>
+      <w:tr>
+        <w:tc>
+          <w:tcPr>
+            <w:shd w:val="clear" w:color="auto" w:fill="F1F5F9"/>
+          </w:tcPr>
+          <w:p>
+            <w:pPr>
+              <w:jc w:val="left"/>
+            </w:pPr>
+            <w:r>
+              <w:rPr>
+                <w:sz w:val="28"/>
+                <w:szCs w:val="28"/>
+              </w:rPr>
+              <w:t xml:space="preserve">updateMasterItem</w:t>
+            </w:r>
+          </w:p>
+        </w:tc>
+        <w:tc>
+          <w:tcPr>
+            <w:shd w:val="clear" w:color="auto" w:fill="F1F5F9"/>
+          </w:tcPr>
+          <w:p>
+            <w:pPr>
+              <w:jc w:val="center"/>
+            </w:pPr>
+            <w:r>
+              <w:rPr>
+                <w:sz w:val="28"/>
+                <w:szCs w:val="28"/>
+              </w:rPr>
+              <w:t xml:space="preserve">-</w:t>
+            </w:r>
+          </w:p>
+        </w:tc>
+        <w:tc>
+          <w:tcPr>
+            <w:shd w:val="clear" w:color="auto" w:fill="F1F5F9"/>
+          </w:tcPr>
+          <w:p>
+            <w:pPr>
+              <w:jc w:val="center"/>
+            </w:pPr>
+            <w:r>
+              <w:rPr>
+                <w:sz w:val="28"/>
+                <w:szCs w:val="28"/>
+              </w:rPr>
+              <w:t xml:space="preserve">-</w:t>
+            </w:r>
+          </w:p>
+        </w:tc>
+        <w:tc>
+          <w:tcPr>
+            <w:shd w:val="clear" w:color="auto" w:fill="F1F5F9"/>
+          </w:tcPr>
+          <w:p>
+            <w:pPr>
+              <w:jc w:val="center"/>
+            </w:pPr>
+            <w:r>
+              <w:rPr>
+                <w:sz w:val="28"/>
+                <w:szCs w:val="28"/>
+              </w:rPr>
+              <w:t xml:space="preserve">Y</w:t>
+            </w:r>
+          </w:p>
+        </w:tc>
+      </w:tr>
+      <w:tr>
+        <w:tc>
+          <w:tcPr>
+            <w:shd w:val="clear" w:color="auto" w:fill="FFFFFF"/>
+          </w:tcPr>
+          <w:p>
+            <w:pPr>
+              <w:jc w:val="left"/>
+            </w:pPr>
+            <w:r>
+              <w:rPr>
+                <w:sz w:val="28"/>
+                <w:szCs w:val="28"/>
+              </w:rPr>
+              <w:t xml:space="preserve">deleteMasterItem</w:t>
             </w:r>
           </w:p>
         </w:tc>
@@ -4511,7 +5292,7 @@
                 <w:sz w:val="28"/>
                 <w:szCs w:val="28"/>
               </w:rPr>
-              <w:t xml:space="preserve">สาขา (Branch_ID, Branch_Name, Province)</w:t>
+              <w:t xml:space="preserve">พื้นที่ 8 แห่ง (Branch_ID, Branch_Name, Province)</w:t>
             </w:r>
           </w:p>
         </w:tc>
@@ -4564,7 +5345,7 @@
                 <w:sz w:val="28"/>
                 <w:szCs w:val="28"/>
               </w:rPr>
-              <w:t xml:space="preserve">แผนก (Department_ID, Department_Name)</w:t>
+              <w:t xml:space="preserve">สาขา 16 แห่ง ผูกกับพื้นที่ (Dept_ID, Dept_Name, Branch_ID)</w:t>
             </w:r>
           </w:p>
         </w:tc>

</xml_diff>